<commit_message>
Working on required modifications Refactored data (allWork only book data, items only locations)
</commit_message>
<xml_diff>
--- a/public/data/critical_paths/Percorso critico 1.docx
+++ b/public/data/critical_paths/Percorso critico 1.docx
@@ -2126,128 +2126,7 @@
         </w:rPr>
         <w:t>città del Nord” menzionate, descritte e raccontate nel romanzo </w:t>
       </w:r>
-      <w:r>
-        <w:rPr>
-          <w:i/>
-          <w:iCs/>
-        </w:rPr>
-        <w:fldChar w:fldCharType="begin"/>
-      </w:r>
-      <w:r>
-        <w:rPr>
-          <w:i/>
-          <w:iCs/>
-        </w:rPr>
-        <w:instrText>HYPERLINK "mappa.html?filter=Location&amp;value=La+vita+in+tempo+di+pace"</w:instrText>
-      </w:r>
-      <w:r>
-        <w:rPr>
-          <w:i/>
-          <w:iCs/>
-        </w:rPr>
-      </w:r>
-      <w:r>
-        <w:rPr>
-          <w:i/>
-          <w:iCs/>
-        </w:rPr>
-        <w:fldChar w:fldCharType="separate"/>
-      </w:r>
-      <w:r>
-        <w:rPr>
-          <w:rStyle w:val="Hyperlink"/>
-          <w:rFonts w:ascii="Garamond" w:eastAsia="Times New Roman" w:hAnsi="Garamond" w:cs="Times New Roman"/>
-          <w:i/>
-          <w:iCs/>
-          <w:kern w:val="0"/>
-          <w:highlight w:val="yellow"/>
-          <w:lang w:eastAsia="it-IT"/>
-          <w14:ligatures w14:val="none"/>
-        </w:rPr>
-        <w:t>La vita in tempo di pace</w:t>
-      </w:r>
-      <w:r>
-        <w:rPr>
-          <w:i/>
-          <w:iCs/>
-        </w:rPr>
-        <w:fldChar w:fldCharType="end"/>
-      </w:r>
-      <w:r>
-        <w:rPr>
-          <w:rFonts w:ascii="Garamond" w:eastAsia="Times New Roman" w:hAnsi="Garamond" w:cs="Times New Roman"/>
-          <w:color w:val="000000"/>
-          <w:kern w:val="0"/>
-          <w:lang w:eastAsia="it-IT"/>
-          <w14:ligatures w14:val="none"/>
-        </w:rPr>
-        <w:t xml:space="preserve"> (2013) di Francesco Pecoraro sono facilmente identificabili, rispettivamente, con </w:t>
-      </w:r>
       <w:hyperlink r:id="rId46" w:history="1">
-        <w:r>
-          <w:rPr>
-            <w:rStyle w:val="Hyperlink"/>
-            <w:rFonts w:ascii="Garamond" w:eastAsia="Times New Roman" w:hAnsi="Garamond" w:cs="Times New Roman"/>
-            <w:kern w:val="0"/>
-            <w:lang w:eastAsia="it-IT"/>
-            <w14:ligatures w14:val="none"/>
-          </w:rPr>
-          <w:t>Roma</w:t>
-        </w:r>
-      </w:hyperlink>
-      <w:r>
-        <w:rPr>
-          <w:rFonts w:ascii="Garamond" w:eastAsia="Times New Roman" w:hAnsi="Garamond" w:cs="Times New Roman"/>
-          <w:color w:val="000000"/>
-          <w:kern w:val="0"/>
-          <w:lang w:eastAsia="it-IT"/>
-          <w14:ligatures w14:val="none"/>
-        </w:rPr>
-        <w:t xml:space="preserve"> e </w:t>
-      </w:r>
-      <w:hyperlink r:id="rId47" w:history="1">
-        <w:r>
-          <w:rPr>
-            <w:rStyle w:val="Hyperlink"/>
-            <w:rFonts w:ascii="Garamond" w:eastAsia="Times New Roman" w:hAnsi="Garamond" w:cs="Times New Roman"/>
-            <w:kern w:val="0"/>
-            <w:lang w:eastAsia="it-IT"/>
-            <w14:ligatures w14:val="none"/>
-          </w:rPr>
-          <w:t>Milano</w:t>
-        </w:r>
-      </w:hyperlink>
-      <w:r>
-        <w:rPr>
-          <w:rFonts w:ascii="Garamond" w:eastAsia="Times New Roman" w:hAnsi="Garamond" w:cs="Times New Roman"/>
-          <w:color w:val="000000"/>
-          <w:kern w:val="0"/>
-          <w:lang w:eastAsia="it-IT"/>
-          <w14:ligatures w14:val="none"/>
-        </w:rPr>
-        <w:t xml:space="preserve"> (la capitale era d’altra parte chiamata “la città di Dio” anche in un </w:t>
-      </w:r>
-      <w:r>
-        <w:rPr>
-          <w:rFonts w:ascii="Garamond" w:eastAsia="Times New Roman" w:hAnsi="Garamond" w:cs="Times New Roman"/>
-          <w:color w:val="000000"/>
-          <w:kern w:val="0"/>
-          <w:lang w:eastAsia="it-IT"/>
-          <w14:ligatures w14:val="none"/>
-        </w:rPr>
-        <w:t>successivo</w:t>
-      </w:r>
-      <w:r>
-        <w:rPr>
-          <w:rFonts w:ascii="Garamond" w:eastAsia="Times New Roman" w:hAnsi="Garamond" w:cs="Times New Roman"/>
-          <w:color w:val="000000"/>
-          <w:kern w:val="0"/>
-          <w:lang w:eastAsia="it-IT"/>
-          <w14:ligatures w14:val="none"/>
-        </w:rPr>
-        <w:t xml:space="preserve"> romanzo di Pecoraro, </w:t>
-      </w:r>
-      <w:hyperlink r:id="rId48" w:history="1">
         <w:r>
           <w:rPr>
             <w:rStyle w:val="Hyperlink"/>
@@ -2259,6 +2138,95 @@
             <w:lang w:eastAsia="it-IT"/>
             <w14:ligatures w14:val="none"/>
           </w:rPr>
+          <w:t>La vita in tempo di pace</w:t>
+        </w:r>
+      </w:hyperlink>
+      <w:r>
+        <w:rPr>
+          <w:rFonts w:ascii="Garamond" w:eastAsia="Times New Roman" w:hAnsi="Garamond" w:cs="Times New Roman"/>
+          <w:color w:val="000000"/>
+          <w:kern w:val="0"/>
+          <w:lang w:eastAsia="it-IT"/>
+          <w14:ligatures w14:val="none"/>
+        </w:rPr>
+        <w:t xml:space="preserve"> (2013) di Francesco Pecoraro sono facilmente identificabili, rispettivamente, con </w:t>
+      </w:r>
+      <w:hyperlink r:id="rId47" w:history="1">
+        <w:r>
+          <w:rPr>
+            <w:rStyle w:val="Hyperlink"/>
+            <w:rFonts w:ascii="Garamond" w:eastAsia="Times New Roman" w:hAnsi="Garamond" w:cs="Times New Roman"/>
+            <w:kern w:val="0"/>
+            <w:lang w:eastAsia="it-IT"/>
+            <w14:ligatures w14:val="none"/>
+          </w:rPr>
+          <w:t>Roma</w:t>
+        </w:r>
+      </w:hyperlink>
+      <w:r>
+        <w:rPr>
+          <w:rFonts w:ascii="Garamond" w:eastAsia="Times New Roman" w:hAnsi="Garamond" w:cs="Times New Roman"/>
+          <w:color w:val="000000"/>
+          <w:kern w:val="0"/>
+          <w:lang w:eastAsia="it-IT"/>
+          <w14:ligatures w14:val="none"/>
+        </w:rPr>
+        <w:t xml:space="preserve"> e </w:t>
+      </w:r>
+      <w:hyperlink r:id="rId48" w:history="1">
+        <w:r>
+          <w:rPr>
+            <w:rStyle w:val="Hyperlink"/>
+            <w:rFonts w:ascii="Garamond" w:eastAsia="Times New Roman" w:hAnsi="Garamond" w:cs="Times New Roman"/>
+            <w:kern w:val="0"/>
+            <w:lang w:eastAsia="it-IT"/>
+            <w14:ligatures w14:val="none"/>
+          </w:rPr>
+          <w:t>Milano</w:t>
+        </w:r>
+      </w:hyperlink>
+      <w:r>
+        <w:rPr>
+          <w:rFonts w:ascii="Garamond" w:eastAsia="Times New Roman" w:hAnsi="Garamond" w:cs="Times New Roman"/>
+          <w:color w:val="000000"/>
+          <w:kern w:val="0"/>
+          <w:lang w:eastAsia="it-IT"/>
+          <w14:ligatures w14:val="none"/>
+        </w:rPr>
+        <w:t xml:space="preserve"> (la capitale era d’altra parte chiamata “la città di Dio” anche in un </w:t>
+      </w:r>
+      <w:r>
+        <w:rPr>
+          <w:rFonts w:ascii="Garamond" w:eastAsia="Times New Roman" w:hAnsi="Garamond" w:cs="Times New Roman"/>
+          <w:color w:val="000000"/>
+          <w:kern w:val="0"/>
+          <w:lang w:eastAsia="it-IT"/>
+          <w14:ligatures w14:val="none"/>
+        </w:rPr>
+        <w:t>successivo</w:t>
+      </w:r>
+      <w:r>
+        <w:rPr>
+          <w:rFonts w:ascii="Garamond" w:eastAsia="Times New Roman" w:hAnsi="Garamond" w:cs="Times New Roman"/>
+          <w:color w:val="000000"/>
+          <w:kern w:val="0"/>
+          <w:lang w:eastAsia="it-IT"/>
+          <w14:ligatures w14:val="none"/>
+        </w:rPr>
+        <w:t xml:space="preserve"> romanzo di Pecoraro, </w:t>
+      </w:r>
+      <w:hyperlink r:id="rId49" w:history="1">
+        <w:r>
+          <w:rPr>
+            <w:rStyle w:val="Hyperlink"/>
+            <w:rFonts w:ascii="Garamond" w:eastAsia="Times New Roman" w:hAnsi="Garamond" w:cs="Times New Roman"/>
+            <w:i/>
+            <w:iCs/>
+            <w:kern w:val="0"/>
+            <w:highlight w:val="yellow"/>
+            <w:lang w:eastAsia="it-IT"/>
+            <w14:ligatures w14:val="none"/>
+          </w:rPr>
           <w:t>Lo stradone</w:t>
         </w:r>
       </w:hyperlink>
@@ -2385,7 +2353,7 @@
         </w:rPr>
         <w:t> </w:t>
       </w:r>
-      <w:hyperlink r:id="rId49" w:history="1">
+      <w:hyperlink r:id="rId50" w:history="1">
         <w:r>
           <w:rPr>
             <w:rStyle w:val="Hyperlink"/>
@@ -2455,7 +2423,7 @@
         </w:rPr>
         <w:t> </w:t>
       </w:r>
-      <w:hyperlink r:id="rId50" w:history="1">
+      <w:hyperlink r:id="rId51" w:history="1">
         <w:r>
           <w:rPr>
             <w:rStyle w:val="Hyperlink"/>
@@ -2490,7 +2458,7 @@
         </w:rPr>
         <w:t> </w:t>
       </w:r>
-      <w:hyperlink r:id="rId51" w:history="1">
+      <w:hyperlink r:id="rId52" w:history="1">
         <w:r>
           <w:rPr>
             <w:rStyle w:val="Hyperlink"/>
@@ -2517,7 +2485,7 @@
         </w:rPr>
         <w:t xml:space="preserve">(2019) di Alessandro Broggi. In entrambi, lo </w:t>
       </w:r>
-      <w:hyperlink r:id="rId52" w:history="1">
+      <w:hyperlink r:id="rId53" w:history="1">
         <w:r>
           <w:rPr>
             <w:rStyle w:val="Hyperlink"/>
@@ -2783,7 +2751,6 @@
         </w:rPr>
         <w:t xml:space="preserve">-S. </w:t>
       </w:r>
-      <w:proofErr w:type="spellStart"/>
       <w:r>
         <w:rPr>
           <w:rFonts w:ascii="Garamond" w:hAnsi="Garamond"/>
@@ -2793,7 +2760,6 @@
         </w:rPr>
         <w:t>Lash</w:t>
       </w:r>
-      <w:proofErr w:type="spellEnd"/>
       <w:r>
         <w:rPr>
           <w:rFonts w:ascii="Garamond" w:hAnsi="Garamond"/>
@@ -3131,7 +3097,6 @@
         <w:t>Non-</w:t>
       </w:r>
       <w:proofErr w:type="spellStart"/>
-      <w:proofErr w:type="gramStart"/>
       <w:r>
         <w:rPr>
           <w:rFonts w:ascii="Garamond" w:hAnsi="Garamond"/>
@@ -3153,19 +3118,7 @@
           <w:sz w:val="20"/>
           <w:szCs w:val="20"/>
         </w:rPr>
-        <w:t xml:space="preserve"> :</w:t>
-      </w:r>
-      <w:proofErr w:type="gramEnd"/>
-      <w:r>
-        <w:rPr>
-          <w:rFonts w:ascii="Garamond" w:hAnsi="Garamond"/>
-          <w:i/>
-          <w:iCs/>
-          <w:color w:val="auto"/>
-          <w:sz w:val="20"/>
-          <w:szCs w:val="20"/>
-        </w:rPr>
-        <w:t xml:space="preserve"> </w:t>
+        <w:t xml:space="preserve"> : </w:t>
       </w:r>
       <w:proofErr w:type="spellStart"/>
       <w:r>

</xml_diff>